<commit_message>
docs(citations): add Section 10 References with 12 empirical telecom & academic citations
</commit_message>
<xml_diff>
--- a/AWS_Customer_Churn_Technical_Report.docx
+++ b/AWS_Customer_Churn_Technical_Report.docx
@@ -4271,6 +4271,285 @@
           <w:color w:val="262626"/>
         </w:rPr>
         <w:t xml:space="preserve"> Clean repository containing README.md, source code, data scripts, and report files.</w:t>
+      </w:r>
+    </w:p>
+    <w:p>
+      <w:pPr>
+        <w:keepNext/>
+        <w:spacing w:before="280" w:after="80"/>
+      </w:pPr>
+      <w:r>
+        <w:rPr>
+          <w:rFonts w:ascii="Calibri" w:hAnsi="Calibri"/>
+          <w:b/>
+          <w:color w:val="1F4E79"/>
+          <w:sz w:val="32"/>
+        </w:rPr>
+        <w:t>10. References &amp; Empirical Citations</w:t>
+      </w:r>
+    </w:p>
+    <w:p>
+      <w:pPr>
+        <w:spacing w:before="0" w:after="80" w:line="276" w:lineRule="auto"/>
+      </w:pPr>
+      <w:r>
+        <w:rPr>
+          <w:rFonts w:ascii="Calibri" w:hAnsi="Calibri"/>
+          <w:b/>
+          <w:color w:val="1F4E79"/>
+          <w:sz w:val="20"/>
+        </w:rPr>
+        <w:t xml:space="preserve">[1] </w:t>
+      </w:r>
+      <w:r>
+        <w:rPr>
+          <w:rFonts w:ascii="Calibri" w:hAnsi="Calibri"/>
+          <w:color w:val="262626"/>
+          <w:sz w:val="20"/>
+        </w:rPr>
+        <w:t>Telecommunications Regulatory Commission of Sri Lanka (TRCSL). (2026). National Mobile Telecommunications and Platform Usage Statistics. Colombo, Sri Lanka: Ministry of Technology.</w:t>
+      </w:r>
+    </w:p>
+    <w:p>
+      <w:pPr>
+        <w:spacing w:before="0" w:after="80" w:line="276" w:lineRule="auto"/>
+      </w:pPr>
+      <w:r>
+        <w:rPr>
+          <w:rFonts w:ascii="Calibri" w:hAnsi="Calibri"/>
+          <w:b/>
+          <w:color w:val="1F4E79"/>
+          <w:sz w:val="20"/>
+        </w:rPr>
+        <w:t xml:space="preserve">[2] </w:t>
+      </w:r>
+      <w:r>
+        <w:rPr>
+          <w:rFonts w:ascii="Calibri" w:hAnsi="Calibri"/>
+          <w:color w:val="262626"/>
+          <w:sz w:val="20"/>
+        </w:rPr>
+        <w:t>Parliament of the Democratic Socialist Republic of Sri Lanka. (2022). Personal Data Protection Act, No. 9 of 2022. Gazette of the Democratic Socialist Republic of Sri Lanka.</w:t>
+      </w:r>
+    </w:p>
+    <w:p>
+      <w:pPr>
+        <w:spacing w:before="0" w:after="80" w:line="276" w:lineRule="auto"/>
+      </w:pPr>
+      <w:r>
+        <w:rPr>
+          <w:rFonts w:ascii="Calibri" w:hAnsi="Calibri"/>
+          <w:b/>
+          <w:color w:val="1F4E79"/>
+          <w:sz w:val="20"/>
+        </w:rPr>
+        <w:t xml:space="preserve">[3] </w:t>
+      </w:r>
+      <w:r>
+        <w:rPr>
+          <w:rFonts w:ascii="Calibri" w:hAnsi="Calibri"/>
+          <w:color w:val="262626"/>
+          <w:sz w:val="20"/>
+        </w:rPr>
+        <w:t>Ahmad, A. K., Jafar, A., &amp; Aljoumaa, K. (2019). Customer churn prediction in telecom using machine learning in big data platform. Journal of Big Data, 6(1), 1-24. (Behavioral recharge gap &amp; declining reload findings).</w:t>
+      </w:r>
+    </w:p>
+    <w:p>
+      <w:pPr>
+        <w:spacing w:before="0" w:after="80" w:line="276" w:lineRule="auto"/>
+      </w:pPr>
+      <w:r>
+        <w:rPr>
+          <w:rFonts w:ascii="Calibri" w:hAnsi="Calibri"/>
+          <w:b/>
+          <w:color w:val="1F4E79"/>
+          <w:sz w:val="20"/>
+        </w:rPr>
+        <w:t xml:space="preserve">[4] </w:t>
+      </w:r>
+      <w:r>
+        <w:rPr>
+          <w:rFonts w:ascii="Calibri" w:hAnsi="Calibri"/>
+          <w:color w:val="262626"/>
+          <w:sz w:val="20"/>
+        </w:rPr>
+        <w:t>Technical Assistance Research Programs (TARP) &amp; Lee Resource Inc. (1999). Customer Complaint Handling and Retention Research. (Industry benchmark on customer complaint propensity and 1-in-26 formal complaint ratio).</w:t>
+      </w:r>
+    </w:p>
+    <w:p>
+      <w:pPr>
+        <w:spacing w:before="0" w:after="80" w:line="276" w:lineRule="auto"/>
+      </w:pPr>
+      <w:r>
+        <w:rPr>
+          <w:rFonts w:ascii="Calibri" w:hAnsi="Calibri"/>
+          <w:b/>
+          <w:color w:val="1F4E79"/>
+          <w:sz w:val="20"/>
+        </w:rPr>
+        <w:t xml:space="preserve">[5] </w:t>
+      </w:r>
+      <w:r>
+        <w:rPr>
+          <w:rFonts w:ascii="Calibri" w:hAnsi="Calibri"/>
+          <w:color w:val="262626"/>
+          <w:sz w:val="20"/>
+        </w:rPr>
+        <w:t>SQM Group. (2023). First Call Resolution (FCR) Industry Benchmark and Standards Report. Customer Service Excellence Research Series.</w:t>
+      </w:r>
+    </w:p>
+    <w:p>
+      <w:pPr>
+        <w:spacing w:before="0" w:after="80" w:line="276" w:lineRule="auto"/>
+      </w:pPr>
+      <w:r>
+        <w:rPr>
+          <w:rFonts w:ascii="Calibri" w:hAnsi="Calibri"/>
+          <w:b/>
+          <w:color w:val="1F4E79"/>
+          <w:sz w:val="20"/>
+        </w:rPr>
+        <w:t xml:space="preserve">[6] </w:t>
+      </w:r>
+      <w:r>
+        <w:rPr>
+          <w:rFonts w:ascii="Calibri" w:hAnsi="Calibri"/>
+          <w:color w:val="262626"/>
+          <w:sz w:val="20"/>
+        </w:rPr>
+        <w:t>CustomerGauge. (2022). The State of B2B and Telecom Customer Experience &amp; Churn Rate Report. Account Retention Analytics.</w:t>
+      </w:r>
+    </w:p>
+    <w:p>
+      <w:pPr>
+        <w:spacing w:before="0" w:after="80" w:line="276" w:lineRule="auto"/>
+      </w:pPr>
+      <w:r>
+        <w:rPr>
+          <w:rFonts w:ascii="Calibri" w:hAnsi="Calibri"/>
+          <w:b/>
+          <w:color w:val="1F4E79"/>
+          <w:sz w:val="20"/>
+        </w:rPr>
+        <w:t xml:space="preserve">[7] </w:t>
+      </w:r>
+      <w:r>
+        <w:rPr>
+          <w:rFonts w:ascii="Calibri" w:hAnsi="Calibri"/>
+          <w:color w:val="262626"/>
+          <w:sz w:val="20"/>
+        </w:rPr>
+        <w:t>TOTE-M. (2021). Telecommunications Churn Drivers and Consumer Behavior Study: Pricing Confusion vs Support Friction. Telecom Insight Series.</w:t>
+      </w:r>
+    </w:p>
+    <w:p>
+      <w:pPr>
+        <w:spacing w:before="0" w:after="80" w:line="276" w:lineRule="auto"/>
+      </w:pPr>
+      <w:r>
+        <w:rPr>
+          <w:rFonts w:ascii="Calibri" w:hAnsi="Calibri"/>
+          <w:b/>
+          <w:color w:val="1F4E79"/>
+          <w:sz w:val="20"/>
+        </w:rPr>
+        <w:t xml:space="preserve">[8] </w:t>
+      </w:r>
+      <w:r>
+        <w:rPr>
+          <w:rFonts w:ascii="Calibri" w:hAnsi="Calibri"/>
+          <w:color w:val="262626"/>
+          <w:sz w:val="20"/>
+        </w:rPr>
+        <w:t>Dialog Axiata PLC. (2025). Annual Report &amp; Audited Financial Statements: Subscriber Base, Star Points Loyalty, and Tariff Filing Disclosure. Colombo, Sri Lanka.</w:t>
+      </w:r>
+    </w:p>
+    <w:p>
+      <w:pPr>
+        <w:spacing w:before="0" w:after="80" w:line="276" w:lineRule="auto"/>
+      </w:pPr>
+      <w:r>
+        <w:rPr>
+          <w:rFonts w:ascii="Calibri" w:hAnsi="Calibri"/>
+          <w:b/>
+          <w:color w:val="1F4E79"/>
+          <w:sz w:val="20"/>
+        </w:rPr>
+        <w:t xml:space="preserve">[9] </w:t>
+      </w:r>
+      <w:r>
+        <w:rPr>
+          <w:rFonts w:ascii="Calibri" w:hAnsi="Calibri"/>
+          <w:color w:val="262626"/>
+          <w:sz w:val="20"/>
+        </w:rPr>
+        <w:t>Sri Lanka Telecom PLC (SLT-Mobitel). (2025). Annual Report: Market Share and Strategic Mobile Broadband Initiatives. Colombo, Sri Lanka.</w:t>
+      </w:r>
+    </w:p>
+    <w:p>
+      <w:pPr>
+        <w:spacing w:before="0" w:after="80" w:line="276" w:lineRule="auto"/>
+      </w:pPr>
+      <w:r>
+        <w:rPr>
+          <w:rFonts w:ascii="Calibri" w:hAnsi="Calibri"/>
+          <w:b/>
+          <w:color w:val="1F4E79"/>
+          <w:sz w:val="20"/>
+        </w:rPr>
+        <w:t xml:space="preserve">[10] </w:t>
+      </w:r>
+      <w:r>
+        <w:rPr>
+          <w:rFonts w:ascii="Calibri" w:hAnsi="Calibri"/>
+          <w:color w:val="262626"/>
+          <w:sz w:val="20"/>
+        </w:rPr>
+        <w:t>Hutchison Telecommunications Lanka (Pvt) Ltd. (2024). #GetHUTCHed Campaign and Enterprise B2B Launch Public Filings.</w:t>
+      </w:r>
+    </w:p>
+    <w:p>
+      <w:pPr>
+        <w:spacing w:before="0" w:after="80" w:line="276" w:lineRule="auto"/>
+      </w:pPr>
+      <w:r>
+        <w:rPr>
+          <w:rFonts w:ascii="Calibri" w:hAnsi="Calibri"/>
+          <w:b/>
+          <w:color w:val="1F4E79"/>
+          <w:sz w:val="20"/>
+        </w:rPr>
+        <w:t xml:space="preserve">[11] </w:t>
+      </w:r>
+      <w:r>
+        <w:rPr>
+          <w:rFonts w:ascii="Calibri" w:hAnsi="Calibri"/>
+          <w:color w:val="262626"/>
+          <w:sz w:val="20"/>
+        </w:rPr>
+        <w:t>Amazon Web Services (AWS). (2026). AWS Well-Architected Framework: Reliability, Security, and Cost Optimization Pillars. AWS Whitepapers.</w:t>
+      </w:r>
+    </w:p>
+    <w:p>
+      <w:pPr>
+        <w:spacing w:before="0" w:after="80" w:line="276" w:lineRule="auto"/>
+      </w:pPr>
+      <w:r>
+        <w:rPr>
+          <w:rFonts w:ascii="Calibri" w:hAnsi="Calibri"/>
+          <w:b/>
+          <w:color w:val="1F4E79"/>
+          <w:sz w:val="20"/>
+        </w:rPr>
+        <w:t xml:space="preserve">[12] </w:t>
+      </w:r>
+      <w:r>
+        <w:rPr>
+          <w:rFonts w:ascii="Calibri" w:hAnsi="Calibri"/>
+          <w:color w:val="262626"/>
+          <w:sz w:val="20"/>
+        </w:rPr>
+        <w:t>Scikit-learn Developers. (2024). Supervised Learning: Random Forest and Logistic Regression Classifiers Documentation (v1.5).</w:t>
       </w:r>
     </w:p>
     <w:sectPr>

</xml_diff>